<commit_message>
Split bank address into Address/City/Province rows; filename = handle+product+date
- Edit the 3 EN bank templates: replace the single "Account Holder's Registered
  Address" row (own + third blocks) with three rows — Account Holder's Address /
  City / Province — so each fills separately (no concatenation/duplication).
- Remove the old split-then-combine logic and the dedicated address UI; these are
  now ordinary detected payment fields. Prompt updated to map address parts to the
  three fields without duplicating the city.
- Download filename is now <kol-handle>_<product>_<YYYY-MM-DD>.docx (shared
  extractHandle util; falls back to legal name).

Verified: templates re-emit 3 address fields and fill cleanly (Party A intact);
full template suite 103, own/third 8; browser shows 3 address inputs, old section
gone, filename john.creator_Rythmix_2026-06-30.docx.

Co-Authored-By: Claude Opus 4.8 <noreply@anthropic.com>
Claude-Session: https://claude.ai/code/session_01CGeSNFsy62g5tC9GNB95nN
</commit_message>
<xml_diff>
--- a/public/templates/en-bank-iban.docx
+++ b/public/templates/en-bank-iban.docx
@@ -1734,9 +1734,78 @@
                 <w:sz w:val="24"/>
                 <w:highlight w:val="yellow"/>
               </w:rPr>
-              <w:t>Account Holder's Registered Address(contains streets, cities, provinces/state):</w:t>
+              <w:t xml:space="preserve">Account Holder's Address:</w:t>
             </w:r>
           </w:p>
+        </w:tc>
+        <w:tc>
+          <w:tcPr>
+            <w:tcW w:w="4260" w:type="dxa"/>
+            <w:tcMar>
+              <w:top w:w="60" w:type="dxa"/>
+              <w:left w:w="120" w:type="dxa"/>
+              <w:bottom w:w="30" w:type="dxa"/>
+              <w:right w:w="120" w:type="dxa"/>
+            </w:tcMar>
+          </w:tcPr>
+          <w:p>
+            <w:pPr>
+              <w:keepNext w:val="0"/>
+              <w:keepLines w:val="0"/>
+              <w:pageBreakBefore w:val="0"/>
+              <w:widowControl w:val="0"/>
+              <w:kinsoku/>
+              <w:wordWrap/>
+              <w:overflowPunct/>
+              <w:topLinePunct w:val="0"/>
+              <w:autoSpaceDE/>
+              <w:autoSpaceDN/>
+              <w:bidi w:val="0"/>
+              <w:adjustRightInd/>
+              <w:snapToGrid/>
+              <w:spacing w:before="120" w:after="120" w:line="240" w:lineRule="auto"/>
+              <w:ind w:left="0"/>
+              <w:jc w:val="left"/>
+              <w:textAlignment w:val="auto"/>
+              <w:rPr>
+                <w:rFonts w:ascii="Times New Roman" w:hAnsi="Times New Roman" w:eastAsia="等线" w:cs="Arial"/>
+                <w:b/>
+                <w:color w:val="auto"/>
+                <w:sz w:val="24"/>
+                <w:highlight w:val="yellow"/>
+              </w:rPr>
+            </w:pPr>
+          </w:p>
+        </w:tc>
+      </w:tr>
+      <w:tr>
+        <w:tblPrEx>
+          <w:tblBorders>
+            <w:top w:val="single" w:color="DEE0E3" w:sz="0" w:space="0"/>
+            <w:left w:val="single" w:color="DEE0E3" w:sz="0" w:space="0"/>
+            <w:bottom w:val="single" w:color="DEE0E3" w:sz="0" w:space="0"/>
+            <w:right w:val="single" w:color="DEE0E3" w:sz="0" w:space="0"/>
+            <w:insideH w:val="single" w:color="DEE0E3" w:sz="0" w:space="0"/>
+            <w:insideV w:val="single" w:color="DEE0E3" w:sz="0" w:space="0"/>
+          </w:tblBorders>
+          <w:tblCellMar>
+            <w:top w:w="0" w:type="dxa"/>
+            <w:left w:w="10" w:type="dxa"/>
+            <w:bottom w:w="0" w:type="dxa"/>
+            <w:right w:w="10" w:type="dxa"/>
+          </w:tblCellMar>
+        </w:tblPrEx>
+        <w:tc>
+          <w:tcPr>
+            <w:tcW w:w="4260" w:type="dxa"/>
+            <w:tcMar>
+              <w:top w:w="60" w:type="dxa"/>
+              <w:left w:w="120" w:type="dxa"/>
+              <w:bottom w:w="30" w:type="dxa"/>
+              <w:right w:w="120" w:type="dxa"/>
+            </w:tcMar>
+            <w:vAlign w:val="top"/>
+          </w:tcPr>
           <w:p>
             <w:pPr>
               <w:keepNext w:val="0"/>
@@ -1757,6 +1826,55 @@
               <w:jc w:val="left"/>
               <w:textAlignment w:val="auto"/>
               <w:rPr>
+                <w:rFonts w:hint="eastAsia" w:ascii="Times New Roman" w:hAnsi="Times New Roman" w:eastAsia="等线" w:cs="Arial"/>
+                <w:b/>
+                <w:color w:val="auto"/>
+                <w:sz w:val="24"/>
+                <w:highlight w:val="yellow"/>
+              </w:rPr>
+            </w:pPr>
+            <w:r>
+              <w:rPr>
+                <w:rFonts w:hint="eastAsia" w:ascii="Times New Roman" w:hAnsi="Times New Roman" w:eastAsia="等线" w:cs="Arial"/>
+                <w:b/>
+                <w:color w:val="auto"/>
+                <w:sz w:val="24"/>
+                <w:highlight w:val="yellow"/>
+              </w:rPr>
+              <w:t xml:space="preserve">City:</w:t>
+            </w:r>
+          </w:p>
+        </w:tc>
+        <w:tc>
+          <w:tcPr>
+            <w:tcW w:w="4260" w:type="dxa"/>
+            <w:tcMar>
+              <w:top w:w="60" w:type="dxa"/>
+              <w:left w:w="120" w:type="dxa"/>
+              <w:bottom w:w="30" w:type="dxa"/>
+              <w:right w:w="120" w:type="dxa"/>
+            </w:tcMar>
+          </w:tcPr>
+          <w:p>
+            <w:pPr>
+              <w:keepNext w:val="0"/>
+              <w:keepLines w:val="0"/>
+              <w:pageBreakBefore w:val="0"/>
+              <w:widowControl w:val="0"/>
+              <w:kinsoku/>
+              <w:wordWrap/>
+              <w:overflowPunct/>
+              <w:topLinePunct w:val="0"/>
+              <w:autoSpaceDE/>
+              <w:autoSpaceDN/>
+              <w:bidi w:val="0"/>
+              <w:adjustRightInd/>
+              <w:snapToGrid/>
+              <w:spacing w:before="120" w:after="120" w:line="240" w:lineRule="auto"/>
+              <w:ind w:left="0"/>
+              <w:jc w:val="left"/>
+              <w:textAlignment w:val="auto"/>
+              <w:rPr>
                 <w:rFonts w:ascii="Times New Roman" w:hAnsi="Times New Roman" w:eastAsia="等线" w:cs="Arial"/>
                 <w:b/>
                 <w:color w:val="auto"/>
@@ -1764,7 +1882,56 @@
                 <w:highlight w:val="yellow"/>
               </w:rPr>
             </w:pPr>
-            <w:r>
+          </w:p>
+        </w:tc>
+      </w:tr>
+      <w:tr>
+        <w:tblPrEx>
+          <w:tblBorders>
+            <w:top w:val="single" w:color="DEE0E3" w:sz="0" w:space="0"/>
+            <w:left w:val="single" w:color="DEE0E3" w:sz="0" w:space="0"/>
+            <w:bottom w:val="single" w:color="DEE0E3" w:sz="0" w:space="0"/>
+            <w:right w:val="single" w:color="DEE0E3" w:sz="0" w:space="0"/>
+            <w:insideH w:val="single" w:color="DEE0E3" w:sz="0" w:space="0"/>
+            <w:insideV w:val="single" w:color="DEE0E3" w:sz="0" w:space="0"/>
+          </w:tblBorders>
+          <w:tblCellMar>
+            <w:top w:w="0" w:type="dxa"/>
+            <w:left w:w="10" w:type="dxa"/>
+            <w:bottom w:w="0" w:type="dxa"/>
+            <w:right w:w="10" w:type="dxa"/>
+          </w:tblCellMar>
+        </w:tblPrEx>
+        <w:tc>
+          <w:tcPr>
+            <w:tcW w:w="4260" w:type="dxa"/>
+            <w:tcMar>
+              <w:top w:w="60" w:type="dxa"/>
+              <w:left w:w="120" w:type="dxa"/>
+              <w:bottom w:w="30" w:type="dxa"/>
+              <w:right w:w="120" w:type="dxa"/>
+            </w:tcMar>
+            <w:vAlign w:val="top"/>
+          </w:tcPr>
+          <w:p>
+            <w:pPr>
+              <w:keepNext w:val="0"/>
+              <w:keepLines w:val="0"/>
+              <w:pageBreakBefore w:val="0"/>
+              <w:widowControl w:val="0"/>
+              <w:kinsoku/>
+              <w:wordWrap/>
+              <w:overflowPunct/>
+              <w:topLinePunct w:val="0"/>
+              <w:autoSpaceDE/>
+              <w:autoSpaceDN/>
+              <w:bidi w:val="0"/>
+              <w:adjustRightInd/>
+              <w:snapToGrid/>
+              <w:spacing w:before="120" w:after="120" w:line="240" w:lineRule="auto"/>
+              <w:ind w:left="0" w:leftChars="0"/>
+              <w:jc w:val="left"/>
+              <w:textAlignment w:val="auto"/>
               <w:rPr>
                 <w:rFonts w:hint="eastAsia" w:ascii="Times New Roman" w:hAnsi="Times New Roman" w:eastAsia="等线" w:cs="Arial"/>
                 <w:b/>
@@ -1772,7 +1939,16 @@
                 <w:sz w:val="24"/>
                 <w:highlight w:val="yellow"/>
               </w:rPr>
-              <w:t>(The official address linked to the bank account)</w:t>
+            </w:pPr>
+            <w:r>
+              <w:rPr>
+                <w:rFonts w:hint="eastAsia" w:ascii="Times New Roman" w:hAnsi="Times New Roman" w:eastAsia="等线" w:cs="Arial"/>
+                <w:b/>
+                <w:color w:val="auto"/>
+                <w:sz w:val="24"/>
+                <w:highlight w:val="yellow"/>
+              </w:rPr>
+              <w:t xml:space="preserve">Province / State:</w:t>
             </w:r>
           </w:p>
         </w:tc>
@@ -2693,9 +2869,21 @@
                 <w:sz w:val="24"/>
                 <w:highlight w:val="yellow"/>
               </w:rPr>
-              <w:t>Account Holder's Registered Address(contains streets, cities, provinces/state):</w:t>
+              <w:t xml:space="preserve">Account Holder's Address:</w:t>
             </w:r>
           </w:p>
+        </w:tc>
+        <w:tc>
+          <w:tcPr>
+            <w:tcW w:w="4260" w:type="dxa"/>
+            <w:tcMar>
+              <w:top w:w="60" w:type="dxa"/>
+              <w:left w:w="120" w:type="dxa"/>
+              <w:bottom w:w="30" w:type="dxa"/>
+              <w:right w:w="120" w:type="dxa"/>
+            </w:tcMar>
+            <w:vAlign w:val="top"/>
+          </w:tcPr>
           <w:p>
             <w:pPr>
               <w:keepNext w:val="0"/>
@@ -2721,7 +2909,56 @@
                 <w:sz w:val="24"/>
               </w:rPr>
             </w:pPr>
-            <w:r>
+          </w:p>
+        </w:tc>
+      </w:tr>
+      <w:tr>
+        <w:tblPrEx>
+          <w:tblBorders>
+            <w:top w:val="single" w:color="DEE0E3" w:sz="0" w:space="0"/>
+            <w:left w:val="single" w:color="DEE0E3" w:sz="0" w:space="0"/>
+            <w:bottom w:val="single" w:color="DEE0E3" w:sz="0" w:space="0"/>
+            <w:right w:val="single" w:color="DEE0E3" w:sz="0" w:space="0"/>
+            <w:insideH w:val="single" w:color="DEE0E3" w:sz="0" w:space="0"/>
+            <w:insideV w:val="single" w:color="DEE0E3" w:sz="0" w:space="0"/>
+          </w:tblBorders>
+          <w:tblCellMar>
+            <w:top w:w="0" w:type="dxa"/>
+            <w:left w:w="10" w:type="dxa"/>
+            <w:bottom w:w="0" w:type="dxa"/>
+            <w:right w:w="10" w:type="dxa"/>
+          </w:tblCellMar>
+        </w:tblPrEx>
+        <w:tc>
+          <w:tcPr>
+            <w:tcW w:w="4260" w:type="dxa"/>
+            <w:tcMar>
+              <w:top w:w="60" w:type="dxa"/>
+              <w:left w:w="120" w:type="dxa"/>
+              <w:bottom w:w="30" w:type="dxa"/>
+              <w:right w:w="120" w:type="dxa"/>
+            </w:tcMar>
+            <w:vAlign w:val="top"/>
+          </w:tcPr>
+          <w:p>
+            <w:pPr>
+              <w:keepNext w:val="0"/>
+              <w:keepLines w:val="0"/>
+              <w:pageBreakBefore w:val="0"/>
+              <w:widowControl w:val="0"/>
+              <w:kinsoku/>
+              <w:wordWrap/>
+              <w:overflowPunct/>
+              <w:topLinePunct w:val="0"/>
+              <w:autoSpaceDE/>
+              <w:autoSpaceDN/>
+              <w:bidi w:val="0"/>
+              <w:adjustRightInd/>
+              <w:snapToGrid/>
+              <w:spacing w:before="120" w:after="120" w:line="240" w:lineRule="auto"/>
+              <w:ind w:left="0" w:leftChars="0"/>
+              <w:jc w:val="left"/>
+              <w:textAlignment w:val="auto"/>
               <w:rPr>
                 <w:rFonts w:hint="eastAsia" w:ascii="Times New Roman" w:hAnsi="Times New Roman" w:eastAsia="等线" w:cs="Arial"/>
                 <w:b/>
@@ -2729,7 +2966,122 @@
                 <w:sz w:val="24"/>
                 <w:highlight w:val="yellow"/>
               </w:rPr>
-              <w:t>(The official address linked to the bank account)</w:t>
+            </w:pPr>
+            <w:r>
+              <w:rPr>
+                <w:rFonts w:hint="eastAsia" w:ascii="Times New Roman" w:hAnsi="Times New Roman" w:eastAsia="等线" w:cs="Arial"/>
+                <w:b/>
+                <w:color w:val="auto"/>
+                <w:sz w:val="24"/>
+                <w:highlight w:val="yellow"/>
+              </w:rPr>
+              <w:t xml:space="preserve">City:</w:t>
+            </w:r>
+          </w:p>
+        </w:tc>
+        <w:tc>
+          <w:tcPr>
+            <w:tcW w:w="4260" w:type="dxa"/>
+            <w:tcMar>
+              <w:top w:w="60" w:type="dxa"/>
+              <w:left w:w="120" w:type="dxa"/>
+              <w:bottom w:w="30" w:type="dxa"/>
+              <w:right w:w="120" w:type="dxa"/>
+            </w:tcMar>
+            <w:vAlign w:val="top"/>
+          </w:tcPr>
+          <w:p>
+            <w:pPr>
+              <w:keepNext w:val="0"/>
+              <w:keepLines w:val="0"/>
+              <w:pageBreakBefore w:val="0"/>
+              <w:widowControl w:val="0"/>
+              <w:kinsoku/>
+              <w:wordWrap/>
+              <w:overflowPunct/>
+              <w:topLinePunct w:val="0"/>
+              <w:autoSpaceDE/>
+              <w:autoSpaceDN/>
+              <w:bidi w:val="0"/>
+              <w:adjustRightInd/>
+              <w:snapToGrid/>
+              <w:spacing w:before="120" w:after="120" w:line="240" w:lineRule="auto"/>
+              <w:ind w:left="0" w:leftChars="0"/>
+              <w:jc w:val="left"/>
+              <w:textAlignment w:val="auto"/>
+              <w:rPr>
+                <w:rFonts w:ascii="Times New Roman" w:hAnsi="Times New Roman"/>
+                <w:color w:val="auto"/>
+                <w:sz w:val="24"/>
+              </w:rPr>
+            </w:pPr>
+          </w:p>
+        </w:tc>
+      </w:tr>
+      <w:tr>
+        <w:tblPrEx>
+          <w:tblBorders>
+            <w:top w:val="single" w:color="DEE0E3" w:sz="0" w:space="0"/>
+            <w:left w:val="single" w:color="DEE0E3" w:sz="0" w:space="0"/>
+            <w:bottom w:val="single" w:color="DEE0E3" w:sz="0" w:space="0"/>
+            <w:right w:val="single" w:color="DEE0E3" w:sz="0" w:space="0"/>
+            <w:insideH w:val="single" w:color="DEE0E3" w:sz="0" w:space="0"/>
+            <w:insideV w:val="single" w:color="DEE0E3" w:sz="0" w:space="0"/>
+          </w:tblBorders>
+          <w:tblCellMar>
+            <w:top w:w="0" w:type="dxa"/>
+            <w:left w:w="10" w:type="dxa"/>
+            <w:bottom w:w="0" w:type="dxa"/>
+            <w:right w:w="10" w:type="dxa"/>
+          </w:tblCellMar>
+        </w:tblPrEx>
+        <w:tc>
+          <w:tcPr>
+            <w:tcW w:w="4260" w:type="dxa"/>
+            <w:tcMar>
+              <w:top w:w="60" w:type="dxa"/>
+              <w:left w:w="120" w:type="dxa"/>
+              <w:bottom w:w="30" w:type="dxa"/>
+              <w:right w:w="120" w:type="dxa"/>
+            </w:tcMar>
+            <w:vAlign w:val="top"/>
+          </w:tcPr>
+          <w:p>
+            <w:pPr>
+              <w:keepNext w:val="0"/>
+              <w:keepLines w:val="0"/>
+              <w:pageBreakBefore w:val="0"/>
+              <w:widowControl w:val="0"/>
+              <w:kinsoku/>
+              <w:wordWrap/>
+              <w:overflowPunct/>
+              <w:topLinePunct w:val="0"/>
+              <w:autoSpaceDE/>
+              <w:autoSpaceDN/>
+              <w:bidi w:val="0"/>
+              <w:adjustRightInd/>
+              <w:snapToGrid/>
+              <w:spacing w:before="120" w:after="120" w:line="240" w:lineRule="auto"/>
+              <w:ind w:left="0" w:leftChars="0"/>
+              <w:jc w:val="left"/>
+              <w:textAlignment w:val="auto"/>
+              <w:rPr>
+                <w:rFonts w:hint="eastAsia" w:ascii="Times New Roman" w:hAnsi="Times New Roman" w:eastAsia="等线" w:cs="Arial"/>
+                <w:b/>
+                <w:color w:val="auto"/>
+                <w:sz w:val="24"/>
+                <w:highlight w:val="yellow"/>
+              </w:rPr>
+            </w:pPr>
+            <w:r>
+              <w:rPr>
+                <w:rFonts w:hint="eastAsia" w:ascii="Times New Roman" w:hAnsi="Times New Roman" w:eastAsia="等线" w:cs="Arial"/>
+                <w:b/>
+                <w:color w:val="auto"/>
+                <w:sz w:val="24"/>
+                <w:highlight w:val="yellow"/>
+              </w:rPr>
+              <w:t xml:space="preserve">Province / State:</w:t>
             </w:r>
           </w:p>
         </w:tc>

</xml_diff>